<commit_message>
Update project context snapshot; describe the ensemble precisely
- context_adhd_v1.md rewritten from the 2026-09-11 snapshot: locked
  dataset (it still said to keep generating), 12 unpushed commits (it
  said everything was pushed), human spot-check replacing the
  model-pass 0.836, headline results, runtime history, current pending
  list, corrections that must not creep back, safe resume commands.
- Paper: the ensemble takes the max of threshold-centred votes (present
  if any member says present); at its designed 0.5 operating point it
  labels every sampled element present (0.516 at the common 0.55).
  Decoding settings are deterministic, outputs are not bit-for-bit: 7 of
  296 repeated LLM-judge calls returned a different confidence within
  one session (3 verdicts flipped). NUMBERS.md, both Word files,
  SESSION_LOG.md updated.
</commit_message>
<xml_diff>
--- a/paper/EDIA_explained.docx
+++ b/paper/EDIA_explained.docx
@@ -1230,7 +1230,7 @@
         <w:t>ensemble</w:t>
       </w:r>
       <w:r>
-        <w:t xml:space="preserve"> (the maximum present-score of the other three).</w:t>
+        <w:t xml:space="preserve"> (each member’s score is shifted by that member’s own threshold so 0.5 means “present”, then the maximum is taken: present if any member says present).</w:t>
       </w:r>
     </w:p>
     <w:p>
@@ -2597,7 +2597,7 @@
         <w:t>LLM judge</w:t>
       </w:r>
       <w:r>
-        <w:t>, 296-element stratified sample: gap recall 0.047, balanced accuracy 0.495. The inputs were verified (short summaries, correct labels), so this is a genuine yes-bias under a fixed prompt, not a pipeline error. The ensemble takes the maximum present-score and inherits the bias (0.516).</w:t>
+        <w:t>, 296-element stratified sample: gap recall 0.047, balanced accuracy 0.495. The inputs were verified (short summaries, correct labels), so this is a genuine yes-bias under a fixed prompt, not a pipeline error. The ensemble (present if any member says present) inherits the bias: 0.516 at the common 0.55 threshold, and at its designed 0.5 operating point it labels every sampled element present.</w:t>
       </w:r>
     </w:p>
     <w:p>
@@ -5818,6 +5818,24 @@
       </w:pPr>
       <w:r>
         <w:t>Ollama auto-updated to 0.34.4 after the corpus run had finished. Auto-update was then disabled, and the version was checked at the start and end of every phase.</w:t>
+      </w:r>
+    </w:p>
+    <w:p>
+      <w:pPr>
+        <w:pStyle w:val="ListBullet"/>
+        <w:spacing w:after="60"/>
+      </w:pPr>
+      <w:r>
+        <w:t xml:space="preserve">Even within one runtime and session, the LLM judge returned a different confidence on 7 of 296 repeated calls (3 verdicts flipped). The cause was not isolated, but temperature 0 fixes the </w:t>
+      </w:r>
+      <w:r>
+        <w:rPr>
+          <w:i/>
+        </w:rPr>
+        <w:t>settings</w:t>
+      </w:r>
+      <w:r>
+        <w:t>, not bit-for-bit outputs.</w:t>
       </w:r>
     </w:p>
     <w:p>
@@ -8311,7 +8329,7 @@
               <w:rPr>
                 <w:sz w:val="17"/>
               </w:rPr>
-              <w:t>Temperature 0 / deterministic</w:t>
+              <w:t>Temperature 0 / deterministic settings</w:t>
             </w:r>
           </w:p>
         </w:tc>
@@ -8329,7 +8347,7 @@
               <w:rPr>
                 <w:sz w:val="17"/>
               </w:rPr>
-              <w:t>The AI gives the same answer every time</w:t>
+              <w:t>The AI is told to always pick its top answer (almost always the same)</w:t>
             </w:r>
           </w:p>
         </w:tc>
@@ -8347,7 +8365,7 @@
               <w:rPr>
                 <w:sz w:val="17"/>
               </w:rPr>
-              <w:t>Greedy decoding (top-k 1, fixed seed)</w:t>
+              <w:t>Greedy decoding (top-k 1, fixed seed); outputs can still vary slightly across runtimes and runs</w:t>
             </w:r>
           </w:p>
         </w:tc>

</xml_diff>

<commit_message>
Fix multi-hop row: 12.2% was lexical, not semantic; report both (12.2% / 26.8%)
multihop_retrieval.py called score_extraction without a semantic matcher, so its
12.2% was a lexical score, but Table VI listed it under semantic with a dash for
lexical. It now scores both matchers at EDIA's thresholds (0.45 / 0.55). The
conclusion stands: 26.8% semantic is still far below EDIA's 58.3%.
</commit_message>
<xml_diff>
--- a/paper/EDIA_explained.docx
+++ b/paper/EDIA_explained.docx
@@ -4779,7 +4779,7 @@
               <w:t>Multi-hop retrieval</w:t>
             </w:r>
             <w:r>
-              <w:t xml:space="preserve"> (search for the reason, then use it to search for alternatives, and so on): 12%, even though it was </w:t>
+              <w:t xml:space="preserve"> (search for the reason, then use it to search for alternatives, and so on): 12–27%, even though it was </w:t>
             </w:r>
             <w:r>
               <w:rPr>
@@ -5338,7 +5338,7 @@
               <w:rPr>
                 <w:sz w:val="19"/>
               </w:rPr>
-              <w:t>–</w:t>
+              <w:t>12.2%</w:t>
             </w:r>
           </w:p>
         </w:tc>
@@ -5356,7 +5356,7 @@
               <w:rPr>
                 <w:sz w:val="19"/>
               </w:rPr>
-              <w:t>12.2%</w:t>
+              <w:t>26.8%</w:t>
             </w:r>
           </w:p>
         </w:tc>
@@ -5392,7 +5392,7 @@
               <w:rPr>
                 <w:sz w:val="19"/>
               </w:rPr>
-              <w:t>no model</w:t>
+              <w:t>none (TF-IDF, no LLM)</w:t>
             </w:r>
           </w:p>
         </w:tc>

</xml_diff>

<commit_message>
Add extraction precision/F1 (Table VII); score multi-hop on retrieved items only
Precision is the share of extracted elements matching any hand-labelled element at
the completeness threshold (a lower bound: labels are not exhaustive). EDIA has the
best semantic F1 (22.3%); CoT's recall gain does not survive (F1 22.0 -> 18.3 vs the
same-runtime baseline).

Multi-hop completeness now excludes owner/approver like EDIA and matches gold against
retrieved turns only: all 5 of its lexical hits had come from the decision text it is
handed as input. Fair figure 0.0% lexical / 12.8% semantic (was 12.2% / 26.8%).
</commit_message>
<xml_diff>
--- a/paper/EDIA_explained.docx
+++ b/paper/EDIA_explained.docx
@@ -4749,7 +4749,7 @@
               <w:t>“Think step by step” (chain-of-thought):</w:t>
             </w:r>
             <w:r>
-              <w:t xml:space="preserve"> the AI first writes notes, then fills in the form. A tiny gain of 2–3 more reasons found out of 48, and it produced 50% more records, so part of the gain may just be more guesses.</w:t>
+              <w:t xml:space="preserve"> the AI first writes notes, then fills in the form. A tiny gain of 2–3 more reasons found out of 48, and it produced 50% more records, so part of the gain may just be more guesses. Precision confirms it: once the extra output is counted, its F1 actually drops (22.0% to 18.3%).</w:t>
             </w:r>
           </w:p>
           <w:p>
@@ -4779,7 +4779,7 @@
               <w:t>Multi-hop retrieval</w:t>
             </w:r>
             <w:r>
-              <w:t xml:space="preserve"> (search for the reason, then use it to search for alternatives, and so on): 12–27%, even though it was </w:t>
+              <w:t xml:space="preserve"> (search for the reason, then use it to search for alternatives, and so on): about 13% (and 0% under strict word matching), even though it was </w:t>
             </w:r>
             <w:r>
               <w:rPr>
@@ -5338,7 +5338,7 @@
               <w:rPr>
                 <w:sz w:val="19"/>
               </w:rPr>
-              <w:t>12.2%</w:t>
+              <w:t>0.0%</w:t>
             </w:r>
           </w:p>
         </w:tc>
@@ -5356,7 +5356,7 @@
               <w:rPr>
                 <w:sz w:val="19"/>
               </w:rPr>
-              <w:t>26.8%</w:t>
+              <w:t>12.8%</w:t>
             </w:r>
           </w:p>
         </w:tc>

</xml_diff>

<commit_message>
Explainer + Word metadata: all four authors; drop the stray third EDIA expansion
The explainer expanded EDIA as 'Extraction of Decision Information from
Artifacts', copied from an AI-written context note; it now matches the paper.
Both .docx files list all four authors in their file properties.
</commit_message>
<xml_diff>
--- a/paper/EDIA_explained.docx
+++ b/paper/EDIA_explained.docx
@@ -20,10 +20,18 @@
     </w:p>
     <w:p>
       <w:pPr>
+        <w:spacing w:after="80"/>
+      </w:pPr>
+      <w:r>
+        <w:t>Jaitra Shah, Manan Mehta, Soham Dwivedi, Aayusman Pati · Dept. of Computer Science and Business Systems, Mukesh Patel School of Technology Management and Engineering, NMIMS, Mumbai, India</w:t>
+      </w:r>
+    </w:p>
+    <w:p>
+      <w:pPr>
         <w:spacing w:after="200"/>
       </w:pPr>
       <w:r>
-        <w:t>Project: EDIA (Extraction of Decision Information from Artifacts) · Branch: Jaitra · Status as of 26 September 2026 · Companion to the IEEE paper draft (paper/edia_ieee.tex / .docx)</w:t>
+        <w:t>Project: EDIA (Explainable Decision Intelligence Assistant) · Branch: Jaitra · Status as of 26 September 2026 · Companion to the IEEE paper draft (paper/edia_ieee.tex / .docx)</w:t>
       </w:r>
     </w:p>
     <w:p>

</xml_diff>

<commit_message>
Rename the benchmark to edia_db in docs, the IEEE paper and the explainer
Follows the context-file rename. Docs, paper .tex/.docx and the explainer now use
edia_db; the AIIE and AIAT paper files are untouched.
</commit_message>
<xml_diff>
--- a/paper/EDIA_explained.docx
+++ b/paper/EDIA_explained.docx
@@ -525,7 +525,7 @@
               <w:spacing w:after="80"/>
             </w:pPr>
             <w:r>
-              <w:t xml:space="preserve">The paper gives four things: a working system (EDIA), a test set to measure such systems fairly (adhd_v1), an explanation of </w:t>
+              <w:t xml:space="preserve">The paper gives four things: a working system (EDIA), a test set to measure such systems fairly (edia_db), an explanation of </w:t>
             </w:r>
             <w:r>
               <w:rPr>
@@ -704,7 +704,7 @@
               <w:rPr>
                 <w:sz w:val="18"/>
               </w:rPr>
-              <w:t>adhd_v1 benchmark</w:t>
+              <w:t>edia_db benchmark</w:t>
             </w:r>
           </w:p>
         </w:tc>
@@ -1460,7 +1460,7 @@
         <w:pStyle w:val="Heading1"/>
       </w:pPr>
       <w:r>
-        <w:t>4. The test data: adhd_v1 (paper Sec. IV, Table I)</w:t>
+        <w:t>4. The test data: edia_db (paper Sec. IV, Table I)</w:t>
       </w:r>
     </w:p>
     <w:tbl>
@@ -8552,7 +8552,7 @@
               <w:rPr>
                 <w:sz w:val="18"/>
               </w:rPr>
-              <w:t>The adhd_v1 benchmark and the human spot-check</w:t>
+              <w:t>The edia_db benchmark and the human spot-check</w:t>
             </w:r>
           </w:p>
         </w:tc>

</xml_diff>